<commit_message>
chore: 核实 Hold WNS 改为 +21ps；过程稿入 _archive；inbox 19 个旧采集（464 MB）归档进 captures
</commit_message>
<xml_diff>
--- a/比赛报告_填空版_20261019.docx
+++ b/比赛报告_填空版_20261019.docx
@@ -1055,7 +1055,7 @@
                 <w:rFonts w:ascii="Times New Roman" w:hAnsi="Times New Roman" w:eastAsia="宋体"/>
                 <w:sz w:val="18"/>
               </w:rPr>
-              <w:t>Setup WNS +104ps / TNS 0 / 0 违例；Hold WNS +20ps / TNS 0 / 0 违例</w:t>
+              <w:t>Setup WNS +104ps / TNS 0 / 0 违例；Hold WNS +21ps / TNS 0 / 0 违例</w:t>
             </w:r>
           </w:p>
         </w:tc>
@@ -3384,7 +3384,7 @@
                 <w:rFonts w:ascii="Times New Roman" w:hAnsi="Times New Roman" w:eastAsia="宋体"/>
                 <w:sz w:val="18"/>
               </w:rPr>
-              <w:t>Setup WNS +104ps / TNS 0 / 0 违例；Hold WNS +20ps / TNS 0 / 0 违例</w:t>
+              <w:t>Setup WNS +104ps / TNS 0 / 0 违例；Hold WNS +21ps / TNS 0 / 0 违例</w:t>
             </w:r>
           </w:p>
         </w:tc>

</xml_diff>